<commit_message>
First push in a while. Reinstalling on Tellymonster and fixing errors in installation instructions.
</commit_message>
<xml_diff>
--- a/docs/HERMES_Manual.docx
+++ b/docs/HERMES_Manual.docx
@@ -136,7 +136,7 @@
           <w:color w:val="000000" w:themeColor="text1"/>
         </w:rPr>
         <w:drawing>
-          <wp:inline distT="0" distB="0" distL="0" distR="0" wp14:anchorId="29D251C2" wp14:editId="16B10481">
+          <wp:inline distT="0" distB="0" distL="0" distR="0" wp14:anchorId="29D251C2" wp14:editId="77B46B24">
             <wp:extent cx="5943600" cy="1801495"/>
             <wp:effectExtent l="0" t="0" r="0" b="1905"/>
             <wp:docPr id="1973164274" name="Picture 1" descr="Logo, company name&#10;&#10;AI-generated content may be incorrect."/>
@@ -3297,19 +3297,7 @@
         <w:rPr>
           <w:color w:val="000000" w:themeColor="text1"/>
         </w:rPr>
-        <w:t>Run the following code in order</w:t>
-      </w:r>
-      <w:r>
-        <w:rPr>
-          <w:color w:val="000000" w:themeColor="text1"/>
-        </w:rPr>
-        <w:t>, in the directory that you would like HERMES to be installed</w:t>
-      </w:r>
-      <w:r>
-        <w:rPr>
-          <w:color w:val="000000" w:themeColor="text1"/>
-        </w:rPr>
-        <w:t>:</w:t>
+        <w:t>Install pixi and the HERMES directory with the following code. Run this in the directory that you would like HERMES to be installed.</w:t>
       </w:r>
     </w:p>
     <w:p>
@@ -3486,7 +3474,7 @@
           <w:noProof/>
           <w:color w:val="000000" w:themeColor="text1"/>
         </w:rPr>
-        <w:t>my_username</w:t>
+        <w:t>my_usernam</w:t>
       </w:r>
       <w:r>
         <w:rPr>
@@ -3494,7 +3482,23 @@
           <w:noProof/>
           <w:color w:val="000000" w:themeColor="text1"/>
         </w:rPr>
-        <w:t>/Programs/hermes</w:t>
+        <w:t>e</w:t>
+      </w:r>
+      <w:r>
+        <w:rPr>
+          <w:rFonts w:ascii="Courier New" w:hAnsi="Courier New" w:cs="Courier New"/>
+          <w:noProof/>
+          <w:color w:val="000000" w:themeColor="text1"/>
+        </w:rPr>
+        <w:t>/</w:t>
+      </w:r>
+      <w:r>
+        <w:rPr>
+          <w:rFonts w:ascii="Courier New" w:hAnsi="Courier New" w:cs="Courier New"/>
+          <w:noProof/>
+          <w:color w:val="000000" w:themeColor="text1"/>
+        </w:rPr>
+        <w:t>HERMES</w:t>
       </w:r>
     </w:p>
     <w:p>
@@ -3721,7 +3725,44 @@
         <w:rPr>
           <w:color w:val="000000" w:themeColor="text1"/>
         </w:rPr>
-        <w:t>Many necessary files are needed to acquire, unpack, and analyze data. Below is a line for each of these operations.</w:t>
+        <w:t xml:space="preserve">When HERMES is installed, a workspace directory is created but is initially empty. </w:t>
+      </w:r>
+    </w:p>
+    <w:p>
+      <w:pPr>
+        <w:rPr>
+          <w:color w:val="000000" w:themeColor="text1"/>
+        </w:rPr>
+      </w:pPr>
+      <w:r>
+        <w:rPr>
+          <w:color w:val="000000" w:themeColor="text1"/>
+        </w:rPr>
+        <w:t xml:space="preserve">Many necessary files are needed to acquire, unpack, and analyze data. Below is a line </w:t>
+      </w:r>
+      <w:r>
+        <w:rPr>
+          <w:color w:val="000000" w:themeColor="text1"/>
+        </w:rPr>
+        <w:t xml:space="preserve">to copy </w:t>
+      </w:r>
+      <w:r>
+        <w:rPr>
+          <w:color w:val="000000" w:themeColor="text1"/>
+        </w:rPr>
+        <w:t>each of these operations</w:t>
+      </w:r>
+      <w:r>
+        <w:rPr>
+          <w:color w:val="000000" w:themeColor="text1"/>
+        </w:rPr>
+        <w:t xml:space="preserve"> into the workspace</w:t>
+      </w:r>
+      <w:r>
+        <w:rPr>
+          <w:color w:val="000000" w:themeColor="text1"/>
+        </w:rPr>
+        <w:t>.</w:t>
       </w:r>
       <w:r>
         <w:rPr>
@@ -3838,22 +3879,92 @@
           <w:rFonts w:cs="Courier New"/>
           <w:color w:val="000000" w:themeColor="text1"/>
         </w:rPr>
-        <w:t xml:space="preserve"> This will only work if you have </w:t>
-      </w:r>
-      <w:proofErr w:type="gramStart"/>
+        <w:t xml:space="preserve"> This will only work if you have ran </w:t>
+      </w:r>
+      <w:r>
+        <w:rPr>
+          <w:rFonts w:ascii="Courier New" w:hAnsi="Courier New" w:cs="Courier New"/>
+          <w:color w:val="000000" w:themeColor="text1"/>
+        </w:rPr>
+        <w:t>pixi run build-cpp</w:t>
+      </w:r>
       <w:r>
         <w:rPr>
           <w:rFonts w:cs="Courier New"/>
           <w:color w:val="000000" w:themeColor="text1"/>
         </w:rPr>
-        <w:t>ran</w:t>
-      </w:r>
-      <w:proofErr w:type="gramEnd"/>
+        <w:t xml:space="preserve">. You can alternatively </w:t>
+      </w:r>
+      <w:r>
+        <w:rPr>
+          <w:rFonts w:ascii="Courier New" w:hAnsi="Courier New" w:cs="Courier New"/>
+          <w:color w:val="000000" w:themeColor="text1"/>
+        </w:rPr>
+        <w:t>cd</w:t>
+      </w:r>
       <w:r>
         <w:rPr>
           <w:rFonts w:cs="Courier New"/>
           <w:color w:val="000000" w:themeColor="text1"/>
         </w:rPr>
+        <w:t xml:space="preserve"> into </w:t>
+      </w:r>
+      <w:r>
+        <w:rPr>
+          <w:rFonts w:ascii="Courier New" w:hAnsi="Courier New" w:cs="Courier New"/>
+          <w:color w:val="000000" w:themeColor="text1"/>
+        </w:rPr>
+        <w:t>src/chermes</w:t>
+      </w:r>
+      <w:r>
+        <w:rPr>
+          <w:rFonts w:cs="Courier New"/>
+          <w:color w:val="000000" w:themeColor="text1"/>
+        </w:rPr>
+        <w:t xml:space="preserve"> and run </w:t>
+      </w:r>
+      <w:r>
+        <w:rPr>
+          <w:rFonts w:ascii="Courier New" w:hAnsi="Courier New" w:cs="Courier New"/>
+          <w:color w:val="000000" w:themeColor="text1"/>
+        </w:rPr>
+        <w:t>make</w:t>
+      </w:r>
+      <w:r>
+        <w:rPr>
+          <w:rFonts w:cs="Courier New"/>
+          <w:color w:val="000000" w:themeColor="text1"/>
+        </w:rPr>
+        <w:t>.</w:t>
+      </w:r>
+    </w:p>
+    <w:p>
+      <w:pPr>
+        <w:ind w:left="288"/>
+        <w:rPr>
+          <w:color w:val="000000" w:themeColor="text1"/>
+        </w:rPr>
+      </w:pPr>
+      <w:r>
+        <w:rPr>
+          <w:rFonts w:ascii="Courier New" w:hAnsi="Courier New" w:cs="Courier New"/>
+          <w:color w:val="000000" w:themeColor="text1"/>
+        </w:rPr>
+        <w:lastRenderedPageBreak/>
+        <w:t>c</w:t>
+      </w:r>
+      <w:r>
+        <w:rPr>
+          <w:rFonts w:ascii="Courier New" w:hAnsi="Courier New" w:cs="Courier New"/>
+          <w:color w:val="000000" w:themeColor="text1"/>
+        </w:rPr>
+        <w:t>p</w:t>
+      </w:r>
+      <w:r>
+        <w:rPr>
+          <w:rFonts w:ascii="Courier New" w:hAnsi="Courier New" w:cs="Courier New"/>
+          <w:color w:val="000000" w:themeColor="text1"/>
+        </w:rPr>
         <w:t xml:space="preserve"> </w:t>
       </w:r>
       <w:r>
@@ -3861,85 +3972,28 @@
           <w:rFonts w:ascii="Courier New" w:hAnsi="Courier New" w:cs="Courier New"/>
           <w:color w:val="000000" w:themeColor="text1"/>
         </w:rPr>
-        <w:t>pixi run build-cpp</w:t>
-      </w:r>
-      <w:r>
-        <w:rPr>
-          <w:rFonts w:cs="Courier New"/>
-          <w:color w:val="000000" w:themeColor="text1"/>
-        </w:rPr>
-        <w:t xml:space="preserve">. You can alternatively </w:t>
-      </w:r>
-      <w:r>
-        <w:rPr>
-          <w:rFonts w:ascii="Courier New" w:hAnsi="Courier New" w:cs="Courier New"/>
-          <w:color w:val="000000" w:themeColor="text1"/>
-        </w:rPr>
-        <w:t>cd</w:t>
-      </w:r>
-      <w:r>
-        <w:rPr>
-          <w:rFonts w:cs="Courier New"/>
-          <w:color w:val="000000" w:themeColor="text1"/>
-        </w:rPr>
-        <w:t xml:space="preserve"> into </w:t>
-      </w:r>
-      <w:r>
-        <w:rPr>
-          <w:rFonts w:ascii="Courier New" w:hAnsi="Courier New" w:cs="Courier New"/>
-          <w:color w:val="000000" w:themeColor="text1"/>
-        </w:rPr>
         <w:t>src/chermes</w:t>
       </w:r>
       <w:r>
         <w:rPr>
-          <w:rFonts w:cs="Courier New"/>
-          <w:color w:val="000000" w:themeColor="text1"/>
-        </w:rPr>
-        <w:t xml:space="preserve"> and run </w:t>
-      </w:r>
-      <w:r>
-        <w:rPr>
-          <w:rFonts w:ascii="Courier New" w:hAnsi="Courier New" w:cs="Courier New"/>
-          <w:color w:val="000000" w:themeColor="text1"/>
-        </w:rPr>
-        <w:t>make</w:t>
-      </w:r>
-      <w:r>
-        <w:rPr>
-          <w:rFonts w:cs="Courier New"/>
-          <w:color w:val="000000" w:themeColor="text1"/>
-        </w:rPr>
-        <w:t>.</w:t>
-      </w:r>
-    </w:p>
-    <w:p>
-      <w:pPr>
-        <w:ind w:left="288"/>
-        <w:rPr>
-          <w:color w:val="000000" w:themeColor="text1"/>
-        </w:rPr>
-      </w:pPr>
-      <w:r>
-        <w:rPr>
-          <w:rFonts w:ascii="Courier New" w:hAnsi="Courier New" w:cs="Courier New"/>
-          <w:color w:val="000000" w:themeColor="text1"/>
-        </w:rPr>
-        <w:t>c</w:t>
-      </w:r>
-      <w:r>
-        <w:rPr>
-          <w:rFonts w:ascii="Courier New" w:hAnsi="Courier New" w:cs="Courier New"/>
-          <w:color w:val="000000" w:themeColor="text1"/>
-        </w:rPr>
-        <w:t>p</w:t>
-      </w:r>
-      <w:r>
-        <w:rPr>
-          <w:rFonts w:ascii="Courier New" w:hAnsi="Courier New" w:cs="Courier New"/>
-          <w:color w:val="000000" w:themeColor="text1"/>
-        </w:rPr>
-        <w:t xml:space="preserve"> </w:t>
+          <w:rFonts w:ascii="Courier New" w:hAnsi="Courier New" w:cs="Courier New"/>
+          <w:color w:val="000000" w:themeColor="text1"/>
+        </w:rPr>
+        <w:t>/</w:t>
+      </w:r>
+      <w:r>
+        <w:rPr>
+          <w:rFonts w:ascii="Courier New" w:hAnsi="Courier New" w:cs="Courier New"/>
+          <w:color w:val="000000" w:themeColor="text1"/>
+        </w:rPr>
+        <w:t>unpacker.config workspace/ &amp;&amp; c</w:t>
+      </w:r>
+      <w:r>
+        <w:rPr>
+          <w:rFonts w:ascii="Courier New" w:hAnsi="Courier New" w:cs="Courier New"/>
+          <w:color w:val="000000" w:themeColor="text1"/>
+        </w:rPr>
+        <w:t xml:space="preserve">p </w:t>
       </w:r>
       <w:r>
         <w:rPr>
@@ -3960,34 +4014,6 @@
           <w:rFonts w:ascii="Courier New" w:hAnsi="Courier New" w:cs="Courier New"/>
           <w:color w:val="000000" w:themeColor="text1"/>
         </w:rPr>
-        <w:t>unpacker.config workspace/ &amp;&amp; c</w:t>
-      </w:r>
-      <w:r>
-        <w:rPr>
-          <w:rFonts w:ascii="Courier New" w:hAnsi="Courier New" w:cs="Courier New"/>
-          <w:color w:val="000000" w:themeColor="text1"/>
-        </w:rPr>
-        <w:t xml:space="preserve">p </w:t>
-      </w:r>
-      <w:r>
-        <w:rPr>
-          <w:rFonts w:ascii="Courier New" w:hAnsi="Courier New" w:cs="Courier New"/>
-          <w:color w:val="000000" w:themeColor="text1"/>
-        </w:rPr>
-        <w:t>src/chermes</w:t>
-      </w:r>
-      <w:r>
-        <w:rPr>
-          <w:rFonts w:ascii="Courier New" w:hAnsi="Courier New" w:cs="Courier New"/>
-          <w:color w:val="000000" w:themeColor="text1"/>
-        </w:rPr>
-        <w:t>/</w:t>
-      </w:r>
-      <w:r>
-        <w:rPr>
-          <w:rFonts w:ascii="Courier New" w:hAnsi="Courier New" w:cs="Courier New"/>
-          <w:color w:val="000000" w:themeColor="text1"/>
-        </w:rPr>
         <w:t>bin/tpx3SpidrUnpacker workspace</w:t>
       </w:r>
     </w:p>
@@ -4001,7 +4027,6 @@
         <w:rPr>
           <w:color w:val="000000" w:themeColor="text1"/>
         </w:rPr>
-        <w:lastRenderedPageBreak/>
         <w:t>Analyzing data</w:t>
       </w:r>
       <w:r>
@@ -4410,6 +4435,7 @@
       </w:pPr>
       <w:r>
         <w:rPr>
+          <w:noProof/>
           <w:color w:val="000000" w:themeColor="text1"/>
         </w:rPr>
         <w:lastRenderedPageBreak/>
@@ -4462,7 +4488,6 @@
         </w:rPr>
         <w:t xml:space="preserve">The working directory is the location that you want all data to be saved. The only thing you must do before acquiring data inside of this directory is create the </w:t>
       </w:r>
-      <w:proofErr w:type="spellStart"/>
       <w:r>
         <w:rPr>
           <w:rFonts w:ascii="Courier New" w:hAnsi="Courier New" w:cs="Courier New"/>
@@ -4470,7 +4495,6 @@
         </w:rPr>
         <w:t>initFiles</w:t>
       </w:r>
-      <w:proofErr w:type="spellEnd"/>
       <w:r>
         <w:rPr>
           <w:color w:val="000000" w:themeColor="text1"/>
@@ -7935,15 +7959,7 @@
           <w:rFonts w:ascii="Courier New" w:hAnsi="Courier New" w:cs="Courier New"/>
           <w:color w:val="000000" w:themeColor="text1"/>
         </w:rPr>
-        <w:t>, --</w:t>
-      </w:r>
-      <w:proofErr w:type="spellStart"/>
-      <w:r>
-        <w:rPr>
-          <w:rFonts w:ascii="Courier New" w:hAnsi="Courier New" w:cs="Courier New"/>
-          <w:color w:val="000000" w:themeColor="text1"/>
-        </w:rPr>
-        <w:t>inputDi</w:t>
+        <w:t>, --inputDi</w:t>
       </w:r>
       <w:r>
         <w:rPr>
@@ -7952,7 +7968,6 @@
         </w:rPr>
         <w:t>r</w:t>
       </w:r>
-      <w:proofErr w:type="spellEnd"/>
       <w:r>
         <w:rPr>
           <w:color w:val="000000" w:themeColor="text1"/>
@@ -7976,33 +7991,8 @@
           <w:rFonts w:ascii="Courier New" w:hAnsi="Courier New" w:cs="Courier New"/>
           <w:color w:val="000000" w:themeColor="text1"/>
         </w:rPr>
-        <w:t>rawTPX3File, -</w:t>
-      </w:r>
-      <w:proofErr w:type="spellStart"/>
-      <w:r>
-        <w:rPr>
-          <w:rFonts w:ascii="Courier New" w:hAnsi="Courier New" w:cs="Courier New"/>
-          <w:color w:val="000000" w:themeColor="text1"/>
-        </w:rPr>
-        <w:t>i</w:t>
-      </w:r>
-      <w:proofErr w:type="spellEnd"/>
-      <w:r>
-        <w:rPr>
-          <w:rFonts w:ascii="Courier New" w:hAnsi="Courier New" w:cs="Courier New"/>
-          <w:color w:val="000000" w:themeColor="text1"/>
-        </w:rPr>
-        <w:t>, --</w:t>
-      </w:r>
-      <w:proofErr w:type="spellStart"/>
-      <w:r>
-        <w:rPr>
-          <w:rFonts w:ascii="Courier New" w:hAnsi="Courier New" w:cs="Courier New"/>
-          <w:color w:val="000000" w:themeColor="text1"/>
-        </w:rPr>
-        <w:t>inputFile</w:t>
-      </w:r>
-      <w:proofErr w:type="spellEnd"/>
+        <w:t>rawTPX3File, -i, --inputFile</w:t>
+      </w:r>
       <w:r>
         <w:rPr>
           <w:color w:val="000000" w:themeColor="text1"/>
@@ -8039,31 +8029,13 @@
           <w:color w:val="000000" w:themeColor="text1"/>
         </w:rPr>
       </w:pPr>
-      <w:proofErr w:type="spellStart"/>
-      <w:r>
-        <w:rPr>
-          <w:rFonts w:ascii="Courier New" w:hAnsi="Courier New" w:cs="Courier New"/>
-          <w:color w:val="000000" w:themeColor="text1"/>
-        </w:rPr>
-        <w:t>outputFolder</w:t>
-      </w:r>
-      <w:proofErr w:type="spellEnd"/>
-      <w:r>
-        <w:rPr>
-          <w:rFonts w:ascii="Courier New" w:hAnsi="Courier New" w:cs="Courier New"/>
-          <w:color w:val="000000" w:themeColor="text1"/>
-        </w:rPr>
-        <w:t>, -o, --</w:t>
-      </w:r>
-      <w:proofErr w:type="spellStart"/>
-      <w:r>
-        <w:rPr>
-          <w:rFonts w:ascii="Courier New" w:hAnsi="Courier New" w:cs="Courier New"/>
-          <w:color w:val="000000" w:themeColor="text1"/>
-        </w:rPr>
-        <w:t>outputDir</w:t>
-      </w:r>
-      <w:proofErr w:type="spellEnd"/>
+      <w:r>
+        <w:rPr>
+          <w:rFonts w:ascii="Courier New" w:hAnsi="Courier New" w:cs="Courier New"/>
+          <w:color w:val="000000" w:themeColor="text1"/>
+        </w:rPr>
+        <w:t>outputFolder, -o, --outputDir</w:t>
+      </w:r>
       <w:r>
         <w:rPr>
           <w:color w:val="000000" w:themeColor="text1"/>
@@ -8113,17 +8085,8 @@
           <w:rFonts w:ascii="Courier New" w:hAnsi="Courier New" w:cs="Courier New"/>
           <w:color w:val="000000" w:themeColor="text1"/>
         </w:rPr>
-        <w:t>-c, --</w:t>
-      </w:r>
-      <w:proofErr w:type="spellStart"/>
-      <w:r>
-        <w:rPr>
-          <w:rFonts w:ascii="Courier New" w:hAnsi="Courier New" w:cs="Courier New"/>
-          <w:color w:val="000000" w:themeColor="text1"/>
-        </w:rPr>
-        <w:t>configFile</w:t>
-      </w:r>
-      <w:proofErr w:type="spellEnd"/>
+        <w:t>-c, --configFile</w:t>
+      </w:r>
       <w:r>
         <w:rPr>
           <w:color w:val="000000" w:themeColor="text1"/>
@@ -8854,23 +8817,7 @@
           <w:rFonts w:ascii="Courier New" w:hAnsi="Courier New" w:cs="Courier New"/>
           <w:color w:val="000000" w:themeColor="text1"/>
         </w:rPr>
-        <w:t>tpx3SpidrUnpacker -</w:t>
-      </w:r>
-      <w:proofErr w:type="spellStart"/>
-      <w:r>
-        <w:rPr>
-          <w:rFonts w:ascii="Courier New" w:hAnsi="Courier New" w:cs="Courier New"/>
-          <w:color w:val="000000" w:themeColor="text1"/>
-        </w:rPr>
-        <w:t>i</w:t>
-      </w:r>
-      <w:proofErr w:type="spellEnd"/>
-      <w:r>
-        <w:rPr>
-          <w:rFonts w:ascii="Courier New" w:hAnsi="Courier New" w:cs="Courier New"/>
-          <w:color w:val="000000" w:themeColor="text1"/>
-        </w:rPr>
-        <w:t xml:space="preserve"> data/run0001.tpx3 -o output/</w:t>
+        <w:t>tpx3SpidrUnpacker -i data/run0001.tpx3 -o output/</w:t>
       </w:r>
     </w:p>
     <w:p>
@@ -8903,23 +8850,7 @@
           <w:color w:val="000000" w:themeColor="text1"/>
         </w:rPr>
         <w:lastRenderedPageBreak/>
-        <w:t>tpx3SpidrUnpacker -</w:t>
-      </w:r>
-      <w:proofErr w:type="spellStart"/>
-      <w:r>
-        <w:rPr>
-          <w:rFonts w:ascii="Courier New" w:hAnsi="Courier New" w:cs="Courier New"/>
-          <w:color w:val="000000" w:themeColor="text1"/>
-        </w:rPr>
-        <w:t>i</w:t>
-      </w:r>
-      <w:proofErr w:type="spellEnd"/>
-      <w:r>
-        <w:rPr>
-          <w:rFonts w:ascii="Courier New" w:hAnsi="Courier New" w:cs="Courier New"/>
-          <w:color w:val="000000" w:themeColor="text1"/>
-        </w:rPr>
-        <w:t xml:space="preserve"> data/run0001.tpx3 -o output/ -c unpacker.config</w:t>
+        <w:t>tpx3SpidrUnpacker -i data/run0001.tpx3 -o output/ -c unpacker.config</w:t>
       </w:r>
     </w:p>
     <w:p>
@@ -9001,23 +8932,7 @@
           <w:rFonts w:ascii="Courier New" w:hAnsi="Courier New" w:cs="Courier New"/>
           <w:color w:val="000000" w:themeColor="text1"/>
         </w:rPr>
-        <w:t>tpx3SpidrUnpacker -</w:t>
-      </w:r>
-      <w:proofErr w:type="spellStart"/>
-      <w:r>
-        <w:rPr>
-          <w:rFonts w:ascii="Courier New" w:hAnsi="Courier New" w:cs="Courier New"/>
-          <w:color w:val="000000" w:themeColor="text1"/>
-        </w:rPr>
-        <w:t>i</w:t>
-      </w:r>
-      <w:proofErr w:type="spellEnd"/>
-      <w:r>
-        <w:rPr>
-          <w:rFonts w:ascii="Courier New" w:hAnsi="Courier New" w:cs="Courier New"/>
-          <w:color w:val="000000" w:themeColor="text1"/>
-        </w:rPr>
-        <w:t xml:space="preserve"> data/run0002.tpx3 -o output/ -C -S 2 -T 5e-9 -P 3</w:t>
+        <w:t>tpx3SpidrUnpacker -i data/run0002.tpx3 -o output/ -C -S 2 -T 5e-9 -P 3</w:t>
       </w:r>
     </w:p>
     <w:p>
@@ -9302,16 +9217,8 @@
               <w:rPr>
                 <w:color w:val="000000" w:themeColor="text1"/>
               </w:rPr>
-              <w:t>.</w:t>
+              <w:t>.exportpixels</w:t>
             </w:r>
-            <w:proofErr w:type="spellStart"/>
-            <w:r>
-              <w:rPr>
-                <w:color w:val="000000" w:themeColor="text1"/>
-              </w:rPr>
-              <w:t>exportpixels</w:t>
-            </w:r>
-            <w:proofErr w:type="spellEnd"/>
           </w:p>
         </w:tc>
         <w:tc>
@@ -11708,16 +11615,8 @@
         <w:rPr>
           <w:rFonts w:ascii="Courier New" w:hAnsi="Courier New" w:cs="Courier New"/>
         </w:rPr>
-        <w:t>.</w:t>
-      </w:r>
-      <w:proofErr w:type="spellStart"/>
-      <w:r>
-        <w:rPr>
-          <w:rFonts w:ascii="Courier New" w:hAnsi="Courier New" w:cs="Courier New"/>
-        </w:rPr>
-        <w:t>bpc</w:t>
-      </w:r>
-      <w:proofErr w:type="spellEnd"/>
+        <w:t>.bpc</w:t>
+      </w:r>
       <w:r>
         <w:t xml:space="preserve"> and a </w:t>
       </w:r>
@@ -11725,16 +11624,8 @@
         <w:rPr>
           <w:rFonts w:ascii="Courier New" w:hAnsi="Courier New" w:cs="Courier New"/>
         </w:rPr>
-        <w:t>.</w:t>
-      </w:r>
-      <w:proofErr w:type="spellStart"/>
-      <w:r>
-        <w:rPr>
-          <w:rFonts w:ascii="Courier New" w:hAnsi="Courier New" w:cs="Courier New"/>
-        </w:rPr>
-        <w:t>dac</w:t>
-      </w:r>
-      <w:proofErr w:type="spellEnd"/>
+        <w:t>.dac</w:t>
+      </w:r>
       <w:r>
         <w:t xml:space="preserve"> file, both of which are important for data acquisition. </w:t>
       </w:r>
@@ -11758,36 +11649,20 @@
       <w:r>
         <w:t xml:space="preserve">, ensure that </w:t>
       </w:r>
-      <w:proofErr w:type="spellStart"/>
-      <w:r>
-        <w:rPr>
-          <w:rFonts w:ascii="Courier New" w:hAnsi="Courier New" w:cs="Courier New"/>
-        </w:rPr>
-        <w:t>BiasSupplyEnable</w:t>
-      </w:r>
-      <w:proofErr w:type="spellEnd"/>
-      <w:r>
-        <w:rPr>
-          <w:rFonts w:ascii="Courier New" w:hAnsi="Courier New" w:cs="Courier New"/>
-        </w:rPr>
-        <w:t>=true</w:t>
+      <w:r>
+        <w:rPr>
+          <w:rFonts w:ascii="Courier New" w:hAnsi="Courier New" w:cs="Courier New"/>
+        </w:rPr>
+        <w:t>BiasSupplyEnable=true</w:t>
       </w:r>
       <w:r>
         <w:t xml:space="preserve"> and </w:t>
       </w:r>
-      <w:proofErr w:type="spellStart"/>
-      <w:r>
-        <w:rPr>
-          <w:rFonts w:ascii="Courier New" w:hAnsi="Courier New" w:cs="Courier New"/>
-        </w:rPr>
-        <w:t>BiasAdjust</w:t>
-      </w:r>
-      <w:proofErr w:type="spellEnd"/>
-      <w:r>
-        <w:rPr>
-          <w:rFonts w:ascii="Courier New" w:hAnsi="Courier New" w:cs="Courier New"/>
-        </w:rPr>
-        <w:t>=40</w:t>
+      <w:r>
+        <w:rPr>
+          <w:rFonts w:ascii="Courier New" w:hAnsi="Courier New" w:cs="Courier New"/>
+        </w:rPr>
+        <w:t>BiasAdjust=40</w:t>
       </w:r>
       <w:r>
         <w:t xml:space="preserve">. If not, adjust them. </w:t>
@@ -11800,15 +11675,7 @@
         </w:rPr>
       </w:pPr>
       <w:r>
-        <w:t xml:space="preserve">Navigate to the Exposure/Record tab on the bottom, denoted by a camera icon. Set the measurement type to equalization. Click the gear icon next to this drop-down </w:t>
-      </w:r>
-      <w:proofErr w:type="gramStart"/>
-      <w:r>
-        <w:t>menu, and</w:t>
-      </w:r>
-      <w:proofErr w:type="gramEnd"/>
-      <w:r>
-        <w:t xml:space="preserve"> set the pre-set parameters to </w:t>
+        <w:t xml:space="preserve">Navigate to the Exposure/Record tab on the bottom, denoted by a camera icon. Set the measurement type to equalization. Click the gear icon next to this drop-down menu, and set the pre-set parameters to </w:t>
       </w:r>
       <w:r>
         <w:rPr>
@@ -11860,83 +11727,31 @@
         <w:rPr>
           <w:rFonts w:cs="Courier New"/>
         </w:rPr>
-        <w:t xml:space="preserve">When finished, a plot will pop up showing nosy pixels. Ensure that it seems reasonable. With all of this, there are now several files that need to be saved. This can be done by clicking "File -&gt; </w:t>
-      </w:r>
-      <w:proofErr w:type="spellStart"/>
+        <w:t>When finished, a plot will pop up showing nosy pixels. Ensure that it seems reasonable. With all of this, there are now several files that need to be saved. This can be done by clicking "File -&gt; Medipix/Timepix control -&gt; Export pixel config". Save this inside the CameraSettings folder in your Serval directory.</w:t>
+      </w:r>
       <w:r>
         <w:rPr>
           <w:rFonts w:cs="Courier New"/>
         </w:rPr>
-        <w:t>Medipix</w:t>
-      </w:r>
-      <w:proofErr w:type="spellEnd"/>
+        <w:t xml:space="preserve"> By default, it is simplest to just label the file as 'settings' and not provide an extension. This will export 2 files, a .</w:t>
+      </w:r>
+      <w:r>
+        <w:rPr>
+          <w:rFonts w:ascii="Courier New" w:hAnsi="Courier New" w:cs="Courier New"/>
+        </w:rPr>
+        <w:t>bpc</w:t>
+      </w:r>
       <w:r>
         <w:rPr>
           <w:rFonts w:cs="Courier New"/>
         </w:rPr>
-        <w:t>/</w:t>
-      </w:r>
-      <w:proofErr w:type="spellStart"/>
-      <w:r>
-        <w:rPr>
-          <w:rFonts w:cs="Courier New"/>
-        </w:rPr>
-        <w:t>Timepix</w:t>
-      </w:r>
-      <w:proofErr w:type="spellEnd"/>
-      <w:r>
-        <w:rPr>
-          <w:rFonts w:cs="Courier New"/>
-        </w:rPr>
-        <w:t xml:space="preserve"> control -&gt; Export pixel config". Save this inside the </w:t>
-      </w:r>
-      <w:proofErr w:type="spellStart"/>
-      <w:r>
-        <w:rPr>
-          <w:rFonts w:cs="Courier New"/>
-        </w:rPr>
-        <w:t>CameraSettings</w:t>
-      </w:r>
-      <w:proofErr w:type="spellEnd"/>
-      <w:r>
-        <w:rPr>
-          <w:rFonts w:cs="Courier New"/>
-        </w:rPr>
-        <w:t xml:space="preserve"> folder in your Serval directory.</w:t>
-      </w:r>
-      <w:r>
-        <w:rPr>
-          <w:rFonts w:cs="Courier New"/>
-        </w:rPr>
-        <w:t xml:space="preserve"> By default, it is simplest to just label the file as 'settings' and not provide an extension. This will export 2 files, a .</w:t>
-      </w:r>
-      <w:proofErr w:type="spellStart"/>
-      <w:r>
-        <w:rPr>
-          <w:rFonts w:ascii="Courier New" w:hAnsi="Courier New" w:cs="Courier New"/>
-        </w:rPr>
-        <w:t>bpc</w:t>
-      </w:r>
-      <w:proofErr w:type="spellEnd"/>
-      <w:r>
-        <w:rPr>
-          <w:rFonts w:cs="Courier New"/>
-        </w:rPr>
         <w:t xml:space="preserve"> and a .</w:t>
       </w:r>
-      <w:proofErr w:type="spellStart"/>
-      <w:r>
-        <w:rPr>
-          <w:rFonts w:ascii="Courier New" w:hAnsi="Courier New" w:cs="Courier New"/>
-        </w:rPr>
-        <w:t>bpc.dac</w:t>
-      </w:r>
-      <w:proofErr w:type="spellEnd"/>
-      <w:r>
-        <w:rPr>
-          <w:rFonts w:ascii="Courier New" w:hAnsi="Courier New" w:cs="Courier New"/>
-        </w:rPr>
-        <w:t>.</w:t>
+      <w:r>
+        <w:rPr>
+          <w:rFonts w:ascii="Courier New" w:hAnsi="Courier New" w:cs="Courier New"/>
+        </w:rPr>
+        <w:t>bpc.dac.</w:t>
       </w:r>
       <w:r>
         <w:rPr>
@@ -12132,8 +11947,8 @@
       <w:rPr>
         <w:noProof/>
       </w:rPr>
-      <w:pict w14:anchorId="671662ED">
-        <v:rect id="_x0000_i1025" alt="" style="width:355.7pt;height:.05pt;mso-width-percent:0;mso-height-percent:0;mso-width-percent:0;mso-height-percent:0" o:hrpct="760" o:hralign="center" o:hrstd="t" o:hr="t" fillcolor="#a0a0a0" stroked="f"/>
+      <w:pict w14:anchorId="54D26E63">
+        <v:rect id="_x0000_i1025" alt="" style="width:342.1pt;height:.05pt;mso-width-percent:0;mso-height-percent:0;mso-width-percent:0;mso-height-percent:0" o:hrpct="731" o:hralign="center" o:hrstd="t" o:hr="t" fillcolor="#a0a0a0" stroked="f"/>
       </w:pict>
     </w:r>
   </w:p>
@@ -12348,7 +12163,7 @@
       <w:rPr>
         <w:noProof/>
       </w:rPr>
-      <w:pict w14:anchorId="03A8F295">
+      <w:pict w14:anchorId="11E11224">
         <v:rect id="_x0000_i1026" alt="" style="width:468pt;height:.05pt;mso-width-percent:0;mso-height-percent:0;mso-width-percent:0;mso-height-percent:0" o:hralign="center" o:hrstd="t" o:hr="t" fillcolor="#a0a0a0" stroked="f"/>
       </w:pict>
     </w:r>

</xml_diff>

<commit_message>
Minor manual changes before new branch
</commit_message>
<xml_diff>
--- a/docs/HERMES_Manual.docx
+++ b/docs/HERMES_Manual.docx
@@ -2744,7 +2744,7 @@
               <w:noProof/>
               <w:color w:val="BF4E14" w:themeColor="accent2" w:themeShade="BF"/>
             </w:rPr>
-            <w:t>Appendix!!!!!!!</w:t>
+            <w:t>Appendix</w:t>
           </w:r>
           <w:r>
             <w:rPr>
@@ -4196,7 +4196,31 @@
         <w:rPr>
           <w:color w:val="000000" w:themeColor="text1"/>
         </w:rPr>
-        <w:t xml:space="preserve"> the camera, setting up run directories, logging configuration files, and perform acquisition runs.</w:t>
+        <w:t xml:space="preserve"> the camera, set</w:t>
+      </w:r>
+      <w:r>
+        <w:rPr>
+          <w:color w:val="000000" w:themeColor="text1"/>
+        </w:rPr>
+        <w:t xml:space="preserve"> </w:t>
+      </w:r>
+      <w:r>
+        <w:rPr>
+          <w:color w:val="000000" w:themeColor="text1"/>
+        </w:rPr>
+        <w:t>up run directories, log</w:t>
+      </w:r>
+      <w:r>
+        <w:rPr>
+          <w:color w:val="000000" w:themeColor="text1"/>
+        </w:rPr>
+        <w:t xml:space="preserve"> </w:t>
+      </w:r>
+      <w:r>
+        <w:rPr>
+          <w:color w:val="000000" w:themeColor="text1"/>
+        </w:rPr>
+        <w:t>configuration files, and perform acquisition runs.</w:t>
       </w:r>
     </w:p>
     <w:p>
@@ -11947,7 +11971,7 @@
       <w:rPr>
         <w:noProof/>
       </w:rPr>
-      <w:pict w14:anchorId="54D26E63">
+      <w:pict w14:anchorId="060122B1">
         <v:rect id="_x0000_i1025" alt="" style="width:342.1pt;height:.05pt;mso-width-percent:0;mso-height-percent:0;mso-width-percent:0;mso-height-percent:0" o:hrpct="731" o:hralign="center" o:hrstd="t" o:hr="t" fillcolor="#a0a0a0" stroked="f"/>
       </w:pict>
     </w:r>
@@ -12163,7 +12187,7 @@
       <w:rPr>
         <w:noProof/>
       </w:rPr>
-      <w:pict w14:anchorId="11E11224">
+      <w:pict w14:anchorId="1C33576B">
         <v:rect id="_x0000_i1026" alt="" style="width:468pt;height:.05pt;mso-width-percent:0;mso-height-percent:0;mso-width-percent:0;mso-height-percent:0" o:hralign="center" o:hrstd="t" o:hr="t" fillcolor="#a0a0a0" stroked="f"/>
       </w:pict>
     </w:r>

</xml_diff>